<commit_message>
[adb-launch-app-api] Bước 4.2: QA Lead sign-off (có điều kiện) cho API launch app
- Quyết định: SIGN-OFF CÓ ĐIỀU KIỆN
- Coverage: 8/8 SC đủ, 0 P0/P1 bug open
- Điều kiện: DevOps PHẢI smoke test TC-001/006/007 trên thiết bị Android thật trước khi approve production

Plan: docs/plans/PLAN-adb-launch-app-api-2026-08-18/steps/STEP-4.2-qa-lead-signoff.md

Co-Authored-By: Claude Sonnet 5 <noreply@anthropic.com>
</commit_message>
<xml_diff>
--- a/docs/test-plans/TEST-PLAN-adb-launch-app-api.docx
+++ b/docs/test-plans/TEST-PLAN-adb-launch-app-api.docx
@@ -3037,6 +3037,1504 @@
         <w:t>Dotnet test sau khi hoàn thành: 42/42 PASS</w:t>
       </w:r>
     </w:p>
+    <w:p>
+      <w:pPr>
+        <w:pBdr>
+          <w:bottom w:val="single" w:sz="6" w:space="1" w:color="F05922"/>
+        </w:pBdr>
+        <w:spacing w:after="120"/>
+      </w:pPr>
+    </w:p>
+    <w:p>
+      <w:pPr>
+        <w:pStyle w:val="Heading2"/>
+        <w:spacing w:before="200" w:after="80"/>
+      </w:pPr>
+      <w:r>
+        <w:rPr>
+          <w:color w:val="F05922"/>
+          <w:sz w:val="28"/>
+        </w:rPr>
+        <w:t>10. QA Lead Sign-off</w:t>
+      </w:r>
+    </w:p>
+    <w:p>
+      <w:pPr>
+        <w:spacing w:after="80"/>
+      </w:pPr>
+      <w:r>
+        <w:rPr>
+          <w:b/>
+          <w:sz w:val="21"/>
+        </w:rPr>
+        <w:t>Ngày:</w:t>
+      </w:r>
+      <w:r>
+        <w:rPr>
+          <w:sz w:val="21"/>
+        </w:rPr>
+        <w:t xml:space="preserve"> 2026-08-18 17:07</w:t>
+      </w:r>
+    </w:p>
+    <w:p>
+      <w:pPr>
+        <w:spacing w:after="80"/>
+      </w:pPr>
+      <w:r>
+        <w:rPr>
+          <w:b/>
+          <w:sz w:val="21"/>
+        </w:rPr>
+        <w:t>QA Lead:</w:t>
+      </w:r>
+      <w:r>
+        <w:rPr>
+          <w:sz w:val="21"/>
+        </w:rPr>
+        <w:t xml:space="preserve"> trongtv@kztek.vn</w:t>
+      </w:r>
+    </w:p>
+    <w:p>
+      <w:pPr>
+        <w:pStyle w:val="Heading3"/>
+        <w:spacing w:before="160" w:after="60"/>
+      </w:pPr>
+      <w:r>
+        <w:rPr>
+          <w:color w:val="4A3F8C"/>
+          <w:sz w:val="24"/>
+        </w:rPr>
+        <w:t>Đối chiếu coverage với 8 AC (SC-01 đến SC-08)</w:t>
+      </w:r>
+    </w:p>
+    <w:tbl>
+      <w:tblPr>
+        <w:tblStyle w:val="TableGrid"/>
+        <w:tblW w:type="auto" w:w="0"/>
+        <w:tblLook w:firstColumn="1" w:firstRow="1" w:lastColumn="0" w:lastRow="0" w:noHBand="0" w:noVBand="1" w:val="04A0"/>
+      </w:tblPr>
+      <w:tblGrid>
+        <w:gridCol w:w="1938"/>
+        <w:gridCol w:w="1938"/>
+        <w:gridCol w:w="1938"/>
+        <w:gridCol w:w="1938"/>
+        <w:gridCol w:w="1938"/>
+      </w:tblGrid>
+      <w:tr>
+        <w:tc>
+          <w:tcPr>
+            <w:tcW w:type="dxa" w:w="1938"/>
+            <w:shd w:val="clear" w:color="auto" w:fill="251C53"/>
+            <w:tcBorders>
+              <w:top w:val="single" w:sz="4" w:space="0" w:color="251C53"/>
+              <w:left w:val="single" w:sz="4" w:space="0" w:color="251C53"/>
+              <w:bottom w:val="single" w:sz="4" w:space="0" w:color="251C53"/>
+              <w:right w:val="single" w:sz="4" w:space="0" w:color="251C53"/>
+            </w:tcBorders>
+          </w:tcPr>
+          <w:p>
+            <w:r>
+              <w:rPr>
+                <w:b/>
+                <w:color w:val="FFFFFF"/>
+                <w:sz w:val="20"/>
+              </w:rPr>
+              <w:t>AC</w:t>
+            </w:r>
+          </w:p>
+        </w:tc>
+        <w:tc>
+          <w:tcPr>
+            <w:tcW w:type="dxa" w:w="1938"/>
+            <w:shd w:val="clear" w:color="auto" w:fill="251C53"/>
+            <w:tcBorders>
+              <w:top w:val="single" w:sz="4" w:space="0" w:color="251C53"/>
+              <w:left w:val="single" w:sz="4" w:space="0" w:color="251C53"/>
+              <w:bottom w:val="single" w:sz="4" w:space="0" w:color="251C53"/>
+              <w:right w:val="single" w:sz="4" w:space="0" w:color="251C53"/>
+            </w:tcBorders>
+          </w:tcPr>
+          <w:p>
+            <w:r>
+              <w:rPr>
+                <w:b/>
+                <w:color w:val="FFFFFF"/>
+                <w:sz w:val="20"/>
+              </w:rPr>
+              <w:t>Mô tả</w:t>
+            </w:r>
+          </w:p>
+        </w:tc>
+        <w:tc>
+          <w:tcPr>
+            <w:tcW w:type="dxa" w:w="1938"/>
+            <w:shd w:val="clear" w:color="auto" w:fill="251C53"/>
+            <w:tcBorders>
+              <w:top w:val="single" w:sz="4" w:space="0" w:color="251C53"/>
+              <w:left w:val="single" w:sz="4" w:space="0" w:color="251C53"/>
+              <w:bottom w:val="single" w:sz="4" w:space="0" w:color="251C53"/>
+              <w:right w:val="single" w:sz="4" w:space="0" w:color="251C53"/>
+            </w:tcBorders>
+          </w:tcPr>
+          <w:p>
+            <w:r>
+              <w:rPr>
+                <w:b/>
+                <w:color w:val="FFFFFF"/>
+                <w:sz w:val="20"/>
+              </w:rPr>
+              <w:t>TC</w:t>
+            </w:r>
+          </w:p>
+        </w:tc>
+        <w:tc>
+          <w:tcPr>
+            <w:tcW w:type="dxa" w:w="1938"/>
+            <w:shd w:val="clear" w:color="auto" w:fill="251C53"/>
+            <w:tcBorders>
+              <w:top w:val="single" w:sz="4" w:space="0" w:color="251C53"/>
+              <w:left w:val="single" w:sz="4" w:space="0" w:color="251C53"/>
+              <w:bottom w:val="single" w:sz="4" w:space="0" w:color="251C53"/>
+              <w:right w:val="single" w:sz="4" w:space="0" w:color="251C53"/>
+            </w:tcBorders>
+          </w:tcPr>
+          <w:p>
+            <w:r>
+              <w:rPr>
+                <w:b/>
+                <w:color w:val="FFFFFF"/>
+                <w:sz w:val="20"/>
+              </w:rPr>
+              <w:t>Phương pháp verify</w:t>
+            </w:r>
+          </w:p>
+        </w:tc>
+        <w:tc>
+          <w:tcPr>
+            <w:tcW w:type="dxa" w:w="1938"/>
+            <w:shd w:val="clear" w:color="auto" w:fill="251C53"/>
+            <w:tcBorders>
+              <w:top w:val="single" w:sz="4" w:space="0" w:color="251C53"/>
+              <w:left w:val="single" w:sz="4" w:space="0" w:color="251C53"/>
+              <w:bottom w:val="single" w:sz="4" w:space="0" w:color="251C53"/>
+              <w:right w:val="single" w:sz="4" w:space="0" w:color="251C53"/>
+            </w:tcBorders>
+          </w:tcPr>
+          <w:p>
+            <w:r>
+              <w:rPr>
+                <w:b/>
+                <w:color w:val="FFFFFF"/>
+                <w:sz w:val="20"/>
+              </w:rPr>
+              <w:t>Kết quả</w:t>
+            </w:r>
+          </w:p>
+        </w:tc>
+      </w:tr>
+      <w:tr>
+        <w:tc>
+          <w:tcPr>
+            <w:tcW w:type="dxa" w:w="1938"/>
+            <w:tcBorders>
+              <w:top w:val="single" w:sz="4" w:space="0" w:color="CBCBCB"/>
+              <w:left w:val="single" w:sz="4" w:space="0" w:color="CBCBCB"/>
+              <w:bottom w:val="single" w:sz="4" w:space="0" w:color="CBCBCB"/>
+              <w:right w:val="single" w:sz="4" w:space="0" w:color="CBCBCB"/>
+            </w:tcBorders>
+          </w:tcPr>
+          <w:p>
+            <w:r>
+              <w:rPr>
+                <w:sz w:val="20"/>
+              </w:rPr>
+              <w:t>---</w:t>
+            </w:r>
+          </w:p>
+        </w:tc>
+        <w:tc>
+          <w:tcPr>
+            <w:tcW w:type="dxa" w:w="1938"/>
+            <w:tcBorders>
+              <w:top w:val="single" w:sz="4" w:space="0" w:color="CBCBCB"/>
+              <w:left w:val="single" w:sz="4" w:space="0" w:color="CBCBCB"/>
+              <w:bottom w:val="single" w:sz="4" w:space="0" w:color="CBCBCB"/>
+              <w:right w:val="single" w:sz="4" w:space="0" w:color="CBCBCB"/>
+            </w:tcBorders>
+          </w:tcPr>
+          <w:p>
+            <w:r>
+              <w:rPr>
+                <w:sz w:val="20"/>
+              </w:rPr>
+              <w:t>---</w:t>
+            </w:r>
+          </w:p>
+        </w:tc>
+        <w:tc>
+          <w:tcPr>
+            <w:tcW w:type="dxa" w:w="1938"/>
+            <w:tcBorders>
+              <w:top w:val="single" w:sz="4" w:space="0" w:color="CBCBCB"/>
+              <w:left w:val="single" w:sz="4" w:space="0" w:color="CBCBCB"/>
+              <w:bottom w:val="single" w:sz="4" w:space="0" w:color="CBCBCB"/>
+              <w:right w:val="single" w:sz="4" w:space="0" w:color="CBCBCB"/>
+            </w:tcBorders>
+          </w:tcPr>
+          <w:p>
+            <w:r>
+              <w:rPr>
+                <w:sz w:val="20"/>
+              </w:rPr>
+              <w:t>---</w:t>
+            </w:r>
+          </w:p>
+        </w:tc>
+        <w:tc>
+          <w:tcPr>
+            <w:tcW w:type="dxa" w:w="1938"/>
+            <w:tcBorders>
+              <w:top w:val="single" w:sz="4" w:space="0" w:color="CBCBCB"/>
+              <w:left w:val="single" w:sz="4" w:space="0" w:color="CBCBCB"/>
+              <w:bottom w:val="single" w:sz="4" w:space="0" w:color="CBCBCB"/>
+              <w:right w:val="single" w:sz="4" w:space="0" w:color="CBCBCB"/>
+            </w:tcBorders>
+          </w:tcPr>
+          <w:p>
+            <w:r>
+              <w:rPr>
+                <w:sz w:val="20"/>
+              </w:rPr>
+              <w:t>---</w:t>
+            </w:r>
+          </w:p>
+        </w:tc>
+        <w:tc>
+          <w:tcPr>
+            <w:tcW w:type="dxa" w:w="1938"/>
+            <w:tcBorders>
+              <w:top w:val="single" w:sz="4" w:space="0" w:color="CBCBCB"/>
+              <w:left w:val="single" w:sz="4" w:space="0" w:color="CBCBCB"/>
+              <w:bottom w:val="single" w:sz="4" w:space="0" w:color="CBCBCB"/>
+              <w:right w:val="single" w:sz="4" w:space="0" w:color="CBCBCB"/>
+            </w:tcBorders>
+          </w:tcPr>
+          <w:p>
+            <w:r>
+              <w:rPr>
+                <w:sz w:val="20"/>
+              </w:rPr>
+              <w:t>---</w:t>
+            </w:r>
+          </w:p>
+        </w:tc>
+      </w:tr>
+      <w:tr>
+        <w:tc>
+          <w:tcPr>
+            <w:tcW w:type="dxa" w:w="1938"/>
+            <w:shd w:val="clear" w:color="auto" w:fill="B8B3D6"/>
+            <w:tcBorders>
+              <w:top w:val="single" w:sz="4" w:space="0" w:color="CBCBCB"/>
+              <w:left w:val="single" w:sz="4" w:space="0" w:color="CBCBCB"/>
+              <w:bottom w:val="single" w:sz="4" w:space="0" w:color="CBCBCB"/>
+              <w:right w:val="single" w:sz="4" w:space="0" w:color="CBCBCB"/>
+            </w:tcBorders>
+          </w:tcPr>
+          <w:p>
+            <w:r>
+              <w:rPr>
+                <w:sz w:val="20"/>
+              </w:rPr>
+              <w:t>SC-01</w:t>
+            </w:r>
+          </w:p>
+        </w:tc>
+        <w:tc>
+          <w:tcPr>
+            <w:tcW w:type="dxa" w:w="1938"/>
+            <w:shd w:val="clear" w:color="auto" w:fill="B8B3D6"/>
+            <w:tcBorders>
+              <w:top w:val="single" w:sz="4" w:space="0" w:color="CBCBCB"/>
+              <w:left w:val="single" w:sz="4" w:space="0" w:color="CBCBCB"/>
+              <w:bottom w:val="single" w:sz="4" w:space="0" w:color="CBCBCB"/>
+              <w:right w:val="single" w:sz="4" w:space="0" w:color="CBCBCB"/>
+            </w:tcBorders>
+          </w:tcPr>
+          <w:p>
+            <w:r>
+              <w:rPr>
+                <w:sz w:val="20"/>
+              </w:rPr>
+              <w:t>Happy path — launch thành công → 200</w:t>
+            </w:r>
+          </w:p>
+        </w:tc>
+        <w:tc>
+          <w:tcPr>
+            <w:tcW w:type="dxa" w:w="1938"/>
+            <w:shd w:val="clear" w:color="auto" w:fill="B8B3D6"/>
+            <w:tcBorders>
+              <w:top w:val="single" w:sz="4" w:space="0" w:color="CBCBCB"/>
+              <w:left w:val="single" w:sz="4" w:space="0" w:color="CBCBCB"/>
+              <w:bottom w:val="single" w:sz="4" w:space="0" w:color="CBCBCB"/>
+              <w:right w:val="single" w:sz="4" w:space="0" w:color="CBCBCB"/>
+            </w:tcBorders>
+          </w:tcPr>
+          <w:p>
+            <w:r>
+              <w:rPr>
+                <w:sz w:val="20"/>
+              </w:rPr>
+              <w:t>TC-001</w:t>
+            </w:r>
+          </w:p>
+        </w:tc>
+        <w:tc>
+          <w:tcPr>
+            <w:tcW w:type="dxa" w:w="1938"/>
+            <w:shd w:val="clear" w:color="auto" w:fill="B8B3D6"/>
+            <w:tcBorders>
+              <w:top w:val="single" w:sz="4" w:space="0" w:color="CBCBCB"/>
+              <w:left w:val="single" w:sz="4" w:space="0" w:color="CBCBCB"/>
+              <w:bottom w:val="single" w:sz="4" w:space="0" w:color="CBCBCB"/>
+              <w:right w:val="single" w:sz="4" w:space="0" w:color="CBCBCB"/>
+            </w:tcBorders>
+          </w:tcPr>
+          <w:p>
+            <w:r>
+              <w:rPr>
+                <w:sz w:val="20"/>
+              </w:rPr>
+              <w:t>Unit test gián tiếp (</w:t>
+            </w:r>
+            <w:r>
+              <w:rPr>
+                <w:rFonts w:ascii="Courier New" w:hAnsi="Courier New"/>
+                <w:color w:val="F05922"/>
+                <w:sz w:val="20"/>
+              </w:rPr>
+              <w:t>MapAdbResult_ExitCode0_Returns200</w:t>
+            </w:r>
+            <w:r>
+              <w:rPr>
+                <w:sz w:val="20"/>
+              </w:rPr>
+              <w:t xml:space="preserve">, </w:t>
+            </w:r>
+            <w:r>
+              <w:rPr>
+                <w:rFonts w:ascii="Courier New" w:hAnsi="Courier New"/>
+                <w:color w:val="F05922"/>
+                <w:sz w:val="20"/>
+              </w:rPr>
+              <w:t>CheckDeviceState_OnlineDevice_ReturnsNull</w:t>
+            </w:r>
+            <w:r>
+              <w:rPr>
+                <w:sz w:val="20"/>
+              </w:rPr>
+              <w:t>)</w:t>
+            </w:r>
+          </w:p>
+        </w:tc>
+        <w:tc>
+          <w:tcPr>
+            <w:tcW w:type="dxa" w:w="1938"/>
+            <w:shd w:val="clear" w:color="auto" w:fill="B8B3D6"/>
+            <w:tcBorders>
+              <w:top w:val="single" w:sz="4" w:space="0" w:color="CBCBCB"/>
+              <w:left w:val="single" w:sz="4" w:space="0" w:color="CBCBCB"/>
+              <w:bottom w:val="single" w:sz="4" w:space="0" w:color="CBCBCB"/>
+              <w:right w:val="single" w:sz="4" w:space="0" w:color="CBCBCB"/>
+            </w:tcBorders>
+          </w:tcPr>
+          <w:p>
+            <w:r>
+              <w:rPr>
+                <w:sz w:val="20"/>
+              </w:rPr>
+              <w:t>Pass gián tiếp</w:t>
+            </w:r>
+          </w:p>
+        </w:tc>
+      </w:tr>
+      <w:tr>
+        <w:tc>
+          <w:tcPr>
+            <w:tcW w:type="dxa" w:w="1938"/>
+            <w:tcBorders>
+              <w:top w:val="single" w:sz="4" w:space="0" w:color="CBCBCB"/>
+              <w:left w:val="single" w:sz="4" w:space="0" w:color="CBCBCB"/>
+              <w:bottom w:val="single" w:sz="4" w:space="0" w:color="CBCBCB"/>
+              <w:right w:val="single" w:sz="4" w:space="0" w:color="CBCBCB"/>
+            </w:tcBorders>
+          </w:tcPr>
+          <w:p>
+            <w:r>
+              <w:rPr>
+                <w:sz w:val="20"/>
+              </w:rPr>
+              <w:t>SC-02</w:t>
+            </w:r>
+          </w:p>
+        </w:tc>
+        <w:tc>
+          <w:tcPr>
+            <w:tcW w:type="dxa" w:w="1938"/>
+            <w:tcBorders>
+              <w:top w:val="single" w:sz="4" w:space="0" w:color="CBCBCB"/>
+              <w:left w:val="single" w:sz="4" w:space="0" w:color="CBCBCB"/>
+              <w:bottom w:val="single" w:sz="4" w:space="0" w:color="CBCBCB"/>
+              <w:right w:val="single" w:sz="4" w:space="0" w:color="CBCBCB"/>
+            </w:tcBorders>
+          </w:tcPr>
+          <w:p>
+            <w:r>
+              <w:rPr>
+                <w:sz w:val="20"/>
+              </w:rPr>
+              <w:t>API key sai hoặc thiếu → 401</w:t>
+            </w:r>
+          </w:p>
+        </w:tc>
+        <w:tc>
+          <w:tcPr>
+            <w:tcW w:type="dxa" w:w="1938"/>
+            <w:tcBorders>
+              <w:top w:val="single" w:sz="4" w:space="0" w:color="CBCBCB"/>
+              <w:left w:val="single" w:sz="4" w:space="0" w:color="CBCBCB"/>
+              <w:bottom w:val="single" w:sz="4" w:space="0" w:color="CBCBCB"/>
+              <w:right w:val="single" w:sz="4" w:space="0" w:color="CBCBCB"/>
+            </w:tcBorders>
+          </w:tcPr>
+          <w:p>
+            <w:r>
+              <w:rPr>
+                <w:sz w:val="20"/>
+              </w:rPr>
+              <w:t>TC-002, TC-003</w:t>
+            </w:r>
+          </w:p>
+        </w:tc>
+        <w:tc>
+          <w:tcPr>
+            <w:tcW w:type="dxa" w:w="1938"/>
+            <w:tcBorders>
+              <w:top w:val="single" w:sz="4" w:space="0" w:color="CBCBCB"/>
+              <w:left w:val="single" w:sz="4" w:space="0" w:color="CBCBCB"/>
+              <w:bottom w:val="single" w:sz="4" w:space="0" w:color="CBCBCB"/>
+              <w:right w:val="single" w:sz="4" w:space="0" w:color="CBCBCB"/>
+            </w:tcBorders>
+          </w:tcPr>
+          <w:p>
+            <w:r>
+              <w:rPr>
+                <w:sz w:val="20"/>
+              </w:rPr>
+              <w:t>HTTP thật</w:t>
+            </w:r>
+          </w:p>
+        </w:tc>
+        <w:tc>
+          <w:tcPr>
+            <w:tcW w:type="dxa" w:w="1938"/>
+            <w:tcBorders>
+              <w:top w:val="single" w:sz="4" w:space="0" w:color="CBCBCB"/>
+              <w:left w:val="single" w:sz="4" w:space="0" w:color="CBCBCB"/>
+              <w:bottom w:val="single" w:sz="4" w:space="0" w:color="CBCBCB"/>
+              <w:right w:val="single" w:sz="4" w:space="0" w:color="CBCBCB"/>
+            </w:tcBorders>
+          </w:tcPr>
+          <w:p>
+            <w:r>
+              <w:rPr>
+                <w:sz w:val="20"/>
+              </w:rPr>
+              <w:t>PASS</w:t>
+            </w:r>
+          </w:p>
+        </w:tc>
+      </w:tr>
+      <w:tr>
+        <w:tc>
+          <w:tcPr>
+            <w:tcW w:type="dxa" w:w="1938"/>
+            <w:shd w:val="clear" w:color="auto" w:fill="B8B3D6"/>
+            <w:tcBorders>
+              <w:top w:val="single" w:sz="4" w:space="0" w:color="CBCBCB"/>
+              <w:left w:val="single" w:sz="4" w:space="0" w:color="CBCBCB"/>
+              <w:bottom w:val="single" w:sz="4" w:space="0" w:color="CBCBCB"/>
+              <w:right w:val="single" w:sz="4" w:space="0" w:color="CBCBCB"/>
+            </w:tcBorders>
+          </w:tcPr>
+          <w:p>
+            <w:r>
+              <w:rPr>
+                <w:sz w:val="20"/>
+              </w:rPr>
+              <w:t>SC-03</w:t>
+            </w:r>
+          </w:p>
+        </w:tc>
+        <w:tc>
+          <w:tcPr>
+            <w:tcW w:type="dxa" w:w="1938"/>
+            <w:shd w:val="clear" w:color="auto" w:fill="B8B3D6"/>
+            <w:tcBorders>
+              <w:top w:val="single" w:sz="4" w:space="0" w:color="CBCBCB"/>
+              <w:left w:val="single" w:sz="4" w:space="0" w:color="CBCBCB"/>
+              <w:bottom w:val="single" w:sz="4" w:space="0" w:color="CBCBCB"/>
+              <w:right w:val="single" w:sz="4" w:space="0" w:color="CBCBCB"/>
+            </w:tcBorders>
+          </w:tcPr>
+          <w:p>
+            <w:r>
+              <w:rPr>
+                <w:sz w:val="20"/>
+              </w:rPr>
+              <w:t>Serial không tồn tại → 404</w:t>
+            </w:r>
+          </w:p>
+        </w:tc>
+        <w:tc>
+          <w:tcPr>
+            <w:tcW w:type="dxa" w:w="1938"/>
+            <w:shd w:val="clear" w:color="auto" w:fill="B8B3D6"/>
+            <w:tcBorders>
+              <w:top w:val="single" w:sz="4" w:space="0" w:color="CBCBCB"/>
+              <w:left w:val="single" w:sz="4" w:space="0" w:color="CBCBCB"/>
+              <w:bottom w:val="single" w:sz="4" w:space="0" w:color="CBCBCB"/>
+              <w:right w:val="single" w:sz="4" w:space="0" w:color="CBCBCB"/>
+            </w:tcBorders>
+          </w:tcPr>
+          <w:p>
+            <w:r>
+              <w:rPr>
+                <w:sz w:val="20"/>
+              </w:rPr>
+              <w:t>TC-004</w:t>
+            </w:r>
+          </w:p>
+        </w:tc>
+        <w:tc>
+          <w:tcPr>
+            <w:tcW w:type="dxa" w:w="1938"/>
+            <w:shd w:val="clear" w:color="auto" w:fill="B8B3D6"/>
+            <w:tcBorders>
+              <w:top w:val="single" w:sz="4" w:space="0" w:color="CBCBCB"/>
+              <w:left w:val="single" w:sz="4" w:space="0" w:color="CBCBCB"/>
+              <w:bottom w:val="single" w:sz="4" w:space="0" w:color="CBCBCB"/>
+              <w:right w:val="single" w:sz="4" w:space="0" w:color="CBCBCB"/>
+            </w:tcBorders>
+          </w:tcPr>
+          <w:p>
+            <w:r>
+              <w:rPr>
+                <w:sz w:val="20"/>
+              </w:rPr>
+              <w:t>HTTP thật</w:t>
+            </w:r>
+          </w:p>
+        </w:tc>
+        <w:tc>
+          <w:tcPr>
+            <w:tcW w:type="dxa" w:w="1938"/>
+            <w:shd w:val="clear" w:color="auto" w:fill="B8B3D6"/>
+            <w:tcBorders>
+              <w:top w:val="single" w:sz="4" w:space="0" w:color="CBCBCB"/>
+              <w:left w:val="single" w:sz="4" w:space="0" w:color="CBCBCB"/>
+              <w:bottom w:val="single" w:sz="4" w:space="0" w:color="CBCBCB"/>
+              <w:right w:val="single" w:sz="4" w:space="0" w:color="CBCBCB"/>
+            </w:tcBorders>
+          </w:tcPr>
+          <w:p>
+            <w:r>
+              <w:rPr>
+                <w:sz w:val="20"/>
+              </w:rPr>
+              <w:t>PASS</w:t>
+            </w:r>
+          </w:p>
+        </w:tc>
+      </w:tr>
+      <w:tr>
+        <w:tc>
+          <w:tcPr>
+            <w:tcW w:type="dxa" w:w="1938"/>
+            <w:tcBorders>
+              <w:top w:val="single" w:sz="4" w:space="0" w:color="CBCBCB"/>
+              <w:left w:val="single" w:sz="4" w:space="0" w:color="CBCBCB"/>
+              <w:bottom w:val="single" w:sz="4" w:space="0" w:color="CBCBCB"/>
+              <w:right w:val="single" w:sz="4" w:space="0" w:color="CBCBCB"/>
+            </w:tcBorders>
+          </w:tcPr>
+          <w:p>
+            <w:r>
+              <w:rPr>
+                <w:sz w:val="20"/>
+              </w:rPr>
+              <w:t>SC-04</w:t>
+            </w:r>
+          </w:p>
+        </w:tc>
+        <w:tc>
+          <w:tcPr>
+            <w:tcW w:type="dxa" w:w="1938"/>
+            <w:tcBorders>
+              <w:top w:val="single" w:sz="4" w:space="0" w:color="CBCBCB"/>
+              <w:left w:val="single" w:sz="4" w:space="0" w:color="CBCBCB"/>
+              <w:bottom w:val="single" w:sz="4" w:space="0" w:color="CBCBCB"/>
+              <w:right w:val="single" w:sz="4" w:space="0" w:color="CBCBCB"/>
+            </w:tcBorders>
+          </w:tcPr>
+          <w:p>
+            <w:r>
+              <w:rPr>
+                <w:sz w:val="20"/>
+              </w:rPr>
+              <w:t>Package name rỗng/invalid → 400</w:t>
+            </w:r>
+          </w:p>
+        </w:tc>
+        <w:tc>
+          <w:tcPr>
+            <w:tcW w:type="dxa" w:w="1938"/>
+            <w:tcBorders>
+              <w:top w:val="single" w:sz="4" w:space="0" w:color="CBCBCB"/>
+              <w:left w:val="single" w:sz="4" w:space="0" w:color="CBCBCB"/>
+              <w:bottom w:val="single" w:sz="4" w:space="0" w:color="CBCBCB"/>
+              <w:right w:val="single" w:sz="4" w:space="0" w:color="CBCBCB"/>
+            </w:tcBorders>
+          </w:tcPr>
+          <w:p>
+            <w:r>
+              <w:rPr>
+                <w:sz w:val="20"/>
+              </w:rPr>
+              <w:t>TC-005a/b/c</w:t>
+            </w:r>
+          </w:p>
+        </w:tc>
+        <w:tc>
+          <w:tcPr>
+            <w:tcW w:type="dxa" w:w="1938"/>
+            <w:tcBorders>
+              <w:top w:val="single" w:sz="4" w:space="0" w:color="CBCBCB"/>
+              <w:left w:val="single" w:sz="4" w:space="0" w:color="CBCBCB"/>
+              <w:bottom w:val="single" w:sz="4" w:space="0" w:color="CBCBCB"/>
+              <w:right w:val="single" w:sz="4" w:space="0" w:color="CBCBCB"/>
+            </w:tcBorders>
+          </w:tcPr>
+          <w:p>
+            <w:r>
+              <w:rPr>
+                <w:sz w:val="20"/>
+              </w:rPr>
+              <w:t>HTTP thật (3 sub-case)</w:t>
+            </w:r>
+          </w:p>
+        </w:tc>
+        <w:tc>
+          <w:tcPr>
+            <w:tcW w:type="dxa" w:w="1938"/>
+            <w:tcBorders>
+              <w:top w:val="single" w:sz="4" w:space="0" w:color="CBCBCB"/>
+              <w:left w:val="single" w:sz="4" w:space="0" w:color="CBCBCB"/>
+              <w:bottom w:val="single" w:sz="4" w:space="0" w:color="CBCBCB"/>
+              <w:right w:val="single" w:sz="4" w:space="0" w:color="CBCBCB"/>
+            </w:tcBorders>
+          </w:tcPr>
+          <w:p>
+            <w:r>
+              <w:rPr>
+                <w:sz w:val="20"/>
+              </w:rPr>
+              <w:t>PASS</w:t>
+            </w:r>
+          </w:p>
+        </w:tc>
+      </w:tr>
+      <w:tr>
+        <w:tc>
+          <w:tcPr>
+            <w:tcW w:type="dxa" w:w="1938"/>
+            <w:shd w:val="clear" w:color="auto" w:fill="B8B3D6"/>
+            <w:tcBorders>
+              <w:top w:val="single" w:sz="4" w:space="0" w:color="CBCBCB"/>
+              <w:left w:val="single" w:sz="4" w:space="0" w:color="CBCBCB"/>
+              <w:bottom w:val="single" w:sz="4" w:space="0" w:color="CBCBCB"/>
+              <w:right w:val="single" w:sz="4" w:space="0" w:color="CBCBCB"/>
+            </w:tcBorders>
+          </w:tcPr>
+          <w:p>
+            <w:r>
+              <w:rPr>
+                <w:sz w:val="20"/>
+              </w:rPr>
+              <w:t>SC-05</w:t>
+            </w:r>
+          </w:p>
+        </w:tc>
+        <w:tc>
+          <w:tcPr>
+            <w:tcW w:type="dxa" w:w="1938"/>
+            <w:shd w:val="clear" w:color="auto" w:fill="B8B3D6"/>
+            <w:tcBorders>
+              <w:top w:val="single" w:sz="4" w:space="0" w:color="CBCBCB"/>
+              <w:left w:val="single" w:sz="4" w:space="0" w:color="CBCBCB"/>
+              <w:bottom w:val="single" w:sz="4" w:space="0" w:color="CBCBCB"/>
+              <w:right w:val="single" w:sz="4" w:space="0" w:color="CBCBCB"/>
+            </w:tcBorders>
+          </w:tcPr>
+          <w:p>
+            <w:r>
+              <w:rPr>
+                <w:sz w:val="20"/>
+              </w:rPr>
+              <w:t>Device Offline → 422</w:t>
+            </w:r>
+          </w:p>
+        </w:tc>
+        <w:tc>
+          <w:tcPr>
+            <w:tcW w:type="dxa" w:w="1938"/>
+            <w:shd w:val="clear" w:color="auto" w:fill="B8B3D6"/>
+            <w:tcBorders>
+              <w:top w:val="single" w:sz="4" w:space="0" w:color="CBCBCB"/>
+              <w:left w:val="single" w:sz="4" w:space="0" w:color="CBCBCB"/>
+              <w:bottom w:val="single" w:sz="4" w:space="0" w:color="CBCBCB"/>
+              <w:right w:val="single" w:sz="4" w:space="0" w:color="CBCBCB"/>
+            </w:tcBorders>
+          </w:tcPr>
+          <w:p>
+            <w:r>
+              <w:rPr>
+                <w:sz w:val="20"/>
+              </w:rPr>
+              <w:t>TC-006</w:t>
+            </w:r>
+          </w:p>
+        </w:tc>
+        <w:tc>
+          <w:tcPr>
+            <w:tcW w:type="dxa" w:w="1938"/>
+            <w:shd w:val="clear" w:color="auto" w:fill="B8B3D6"/>
+            <w:tcBorders>
+              <w:top w:val="single" w:sz="4" w:space="0" w:color="CBCBCB"/>
+              <w:left w:val="single" w:sz="4" w:space="0" w:color="CBCBCB"/>
+              <w:bottom w:val="single" w:sz="4" w:space="0" w:color="CBCBCB"/>
+              <w:right w:val="single" w:sz="4" w:space="0" w:color="CBCBCB"/>
+            </w:tcBorders>
+          </w:tcPr>
+          <w:p>
+            <w:r>
+              <w:rPr>
+                <w:sz w:val="20"/>
+              </w:rPr>
+              <w:t>Unit test gián tiếp (</w:t>
+            </w:r>
+            <w:r>
+              <w:rPr>
+                <w:rFonts w:ascii="Courier New" w:hAnsi="Courier New"/>
+                <w:color w:val="F05922"/>
+                <w:sz w:val="20"/>
+              </w:rPr>
+              <w:t>CheckDeviceState_OfflineDevice_Returns422</w:t>
+            </w:r>
+            <w:r>
+              <w:rPr>
+                <w:sz w:val="20"/>
+              </w:rPr>
+              <w:t>)</w:t>
+            </w:r>
+          </w:p>
+        </w:tc>
+        <w:tc>
+          <w:tcPr>
+            <w:tcW w:type="dxa" w:w="1938"/>
+            <w:shd w:val="clear" w:color="auto" w:fill="B8B3D6"/>
+            <w:tcBorders>
+              <w:top w:val="single" w:sz="4" w:space="0" w:color="CBCBCB"/>
+              <w:left w:val="single" w:sz="4" w:space="0" w:color="CBCBCB"/>
+              <w:bottom w:val="single" w:sz="4" w:space="0" w:color="CBCBCB"/>
+              <w:right w:val="single" w:sz="4" w:space="0" w:color="CBCBCB"/>
+            </w:tcBorders>
+          </w:tcPr>
+          <w:p>
+            <w:r>
+              <w:rPr>
+                <w:sz w:val="20"/>
+              </w:rPr>
+              <w:t>Pass gián tiếp</w:t>
+            </w:r>
+          </w:p>
+        </w:tc>
+      </w:tr>
+      <w:tr>
+        <w:tc>
+          <w:tcPr>
+            <w:tcW w:type="dxa" w:w="1938"/>
+            <w:tcBorders>
+              <w:top w:val="single" w:sz="4" w:space="0" w:color="CBCBCB"/>
+              <w:left w:val="single" w:sz="4" w:space="0" w:color="CBCBCB"/>
+              <w:bottom w:val="single" w:sz="4" w:space="0" w:color="CBCBCB"/>
+              <w:right w:val="single" w:sz="4" w:space="0" w:color="CBCBCB"/>
+            </w:tcBorders>
+          </w:tcPr>
+          <w:p>
+            <w:r>
+              <w:rPr>
+                <w:sz w:val="20"/>
+              </w:rPr>
+              <w:t>SC-06</w:t>
+            </w:r>
+          </w:p>
+        </w:tc>
+        <w:tc>
+          <w:tcPr>
+            <w:tcW w:type="dxa" w:w="1938"/>
+            <w:tcBorders>
+              <w:top w:val="single" w:sz="4" w:space="0" w:color="CBCBCB"/>
+              <w:left w:val="single" w:sz="4" w:space="0" w:color="CBCBCB"/>
+              <w:bottom w:val="single" w:sz="4" w:space="0" w:color="CBCBCB"/>
+              <w:right w:val="single" w:sz="4" w:space="0" w:color="CBCBCB"/>
+            </w:tcBorders>
+          </w:tcPr>
+          <w:p>
+            <w:r>
+              <w:rPr>
+                <w:sz w:val="20"/>
+              </w:rPr>
+              <w:t>App không cài trên thiết bị → 422</w:t>
+            </w:r>
+          </w:p>
+        </w:tc>
+        <w:tc>
+          <w:tcPr>
+            <w:tcW w:type="dxa" w:w="1938"/>
+            <w:tcBorders>
+              <w:top w:val="single" w:sz="4" w:space="0" w:color="CBCBCB"/>
+              <w:left w:val="single" w:sz="4" w:space="0" w:color="CBCBCB"/>
+              <w:bottom w:val="single" w:sz="4" w:space="0" w:color="CBCBCB"/>
+              <w:right w:val="single" w:sz="4" w:space="0" w:color="CBCBCB"/>
+            </w:tcBorders>
+          </w:tcPr>
+          <w:p>
+            <w:r>
+              <w:rPr>
+                <w:sz w:val="20"/>
+              </w:rPr>
+              <w:t>TC-007</w:t>
+            </w:r>
+          </w:p>
+        </w:tc>
+        <w:tc>
+          <w:tcPr>
+            <w:tcW w:type="dxa" w:w="1938"/>
+            <w:tcBorders>
+              <w:top w:val="single" w:sz="4" w:space="0" w:color="CBCBCB"/>
+              <w:left w:val="single" w:sz="4" w:space="0" w:color="CBCBCB"/>
+              <w:bottom w:val="single" w:sz="4" w:space="0" w:color="CBCBCB"/>
+              <w:right w:val="single" w:sz="4" w:space="0" w:color="CBCBCB"/>
+            </w:tcBorders>
+          </w:tcPr>
+          <w:p>
+            <w:r>
+              <w:rPr>
+                <w:sz w:val="20"/>
+              </w:rPr>
+              <w:t>Unit test gián tiếp (</w:t>
+            </w:r>
+            <w:r>
+              <w:rPr>
+                <w:rFonts w:ascii="Courier New" w:hAnsi="Courier New"/>
+                <w:color w:val="F05922"/>
+                <w:sz w:val="20"/>
+              </w:rPr>
+              <w:t>MapAdbResult_AppNotInstalled_Returns422</w:t>
+            </w:r>
+            <w:r>
+              <w:rPr>
+                <w:sz w:val="20"/>
+              </w:rPr>
+              <w:t>)</w:t>
+            </w:r>
+          </w:p>
+        </w:tc>
+        <w:tc>
+          <w:tcPr>
+            <w:tcW w:type="dxa" w:w="1938"/>
+            <w:tcBorders>
+              <w:top w:val="single" w:sz="4" w:space="0" w:color="CBCBCB"/>
+              <w:left w:val="single" w:sz="4" w:space="0" w:color="CBCBCB"/>
+              <w:bottom w:val="single" w:sz="4" w:space="0" w:color="CBCBCB"/>
+              <w:right w:val="single" w:sz="4" w:space="0" w:color="CBCBCB"/>
+            </w:tcBorders>
+          </w:tcPr>
+          <w:p>
+            <w:r>
+              <w:rPr>
+                <w:sz w:val="20"/>
+              </w:rPr>
+              <w:t>Pass gián tiếp</w:t>
+            </w:r>
+          </w:p>
+        </w:tc>
+      </w:tr>
+      <w:tr>
+        <w:tc>
+          <w:tcPr>
+            <w:tcW w:type="dxa" w:w="1938"/>
+            <w:shd w:val="clear" w:color="auto" w:fill="B8B3D6"/>
+            <w:tcBorders>
+              <w:top w:val="single" w:sz="4" w:space="0" w:color="CBCBCB"/>
+              <w:left w:val="single" w:sz="4" w:space="0" w:color="CBCBCB"/>
+              <w:bottom w:val="single" w:sz="4" w:space="0" w:color="CBCBCB"/>
+              <w:right w:val="single" w:sz="4" w:space="0" w:color="CBCBCB"/>
+            </w:tcBorders>
+          </w:tcPr>
+          <w:p>
+            <w:r>
+              <w:rPr>
+                <w:sz w:val="20"/>
+              </w:rPr>
+              <w:t>SC-07</w:t>
+            </w:r>
+          </w:p>
+        </w:tc>
+        <w:tc>
+          <w:tcPr>
+            <w:tcW w:type="dxa" w:w="1938"/>
+            <w:shd w:val="clear" w:color="auto" w:fill="B8B3D6"/>
+            <w:tcBorders>
+              <w:top w:val="single" w:sz="4" w:space="0" w:color="CBCBCB"/>
+              <w:left w:val="single" w:sz="4" w:space="0" w:color="CBCBCB"/>
+              <w:bottom w:val="single" w:sz="4" w:space="0" w:color="CBCBCB"/>
+              <w:right w:val="single" w:sz="4" w:space="0" w:color="CBCBCB"/>
+            </w:tcBorders>
+          </w:tcPr>
+          <w:p>
+            <w:r>
+              <w:rPr>
+                <w:sz w:val="20"/>
+              </w:rPr>
+              <w:t>Route cũ không bị ảnh hưởng</w:t>
+            </w:r>
+          </w:p>
+        </w:tc>
+        <w:tc>
+          <w:tcPr>
+            <w:tcW w:type="dxa" w:w="1938"/>
+            <w:shd w:val="clear" w:color="auto" w:fill="B8B3D6"/>
+            <w:tcBorders>
+              <w:top w:val="single" w:sz="4" w:space="0" w:color="CBCBCB"/>
+              <w:left w:val="single" w:sz="4" w:space="0" w:color="CBCBCB"/>
+              <w:bottom w:val="single" w:sz="4" w:space="0" w:color="CBCBCB"/>
+              <w:right w:val="single" w:sz="4" w:space="0" w:color="CBCBCB"/>
+            </w:tcBorders>
+          </w:tcPr>
+          <w:p>
+            <w:r>
+              <w:rPr>
+                <w:sz w:val="20"/>
+              </w:rPr>
+              <w:t>Regression test</w:t>
+            </w:r>
+          </w:p>
+        </w:tc>
+        <w:tc>
+          <w:tcPr>
+            <w:tcW w:type="dxa" w:w="1938"/>
+            <w:shd w:val="clear" w:color="auto" w:fill="B8B3D6"/>
+            <w:tcBorders>
+              <w:top w:val="single" w:sz="4" w:space="0" w:color="CBCBCB"/>
+              <w:left w:val="single" w:sz="4" w:space="0" w:color="CBCBCB"/>
+              <w:bottom w:val="single" w:sz="4" w:space="0" w:color="CBCBCB"/>
+              <w:right w:val="single" w:sz="4" w:space="0" w:color="CBCBCB"/>
+            </w:tcBorders>
+          </w:tcPr>
+          <w:p>
+            <w:r>
+              <w:rPr>
+                <w:sz w:val="20"/>
+              </w:rPr>
+              <w:t>HTTP thật (</w:t>
+            </w:r>
+            <w:r>
+              <w:rPr>
+                <w:rFonts w:ascii="Courier New" w:hAnsi="Courier New"/>
+                <w:color w:val="F05922"/>
+                <w:sz w:val="20"/>
+              </w:rPr>
+              <w:t>GET /api/devices</w:t>
+            </w:r>
+            <w:r>
+              <w:rPr>
+                <w:sz w:val="20"/>
+              </w:rPr>
+              <w:t xml:space="preserve"> không có key → 200)</w:t>
+            </w:r>
+          </w:p>
+        </w:tc>
+        <w:tc>
+          <w:tcPr>
+            <w:tcW w:type="dxa" w:w="1938"/>
+            <w:shd w:val="clear" w:color="auto" w:fill="B8B3D6"/>
+            <w:tcBorders>
+              <w:top w:val="single" w:sz="4" w:space="0" w:color="CBCBCB"/>
+              <w:left w:val="single" w:sz="4" w:space="0" w:color="CBCBCB"/>
+              <w:bottom w:val="single" w:sz="4" w:space="0" w:color="CBCBCB"/>
+              <w:right w:val="single" w:sz="4" w:space="0" w:color="CBCBCB"/>
+            </w:tcBorders>
+          </w:tcPr>
+          <w:p>
+            <w:r>
+              <w:rPr>
+                <w:sz w:val="20"/>
+              </w:rPr>
+              <w:t>PASS</w:t>
+            </w:r>
+          </w:p>
+        </w:tc>
+      </w:tr>
+      <w:tr>
+        <w:tc>
+          <w:tcPr>
+            <w:tcW w:type="dxa" w:w="1938"/>
+            <w:tcBorders>
+              <w:top w:val="single" w:sz="4" w:space="0" w:color="CBCBCB"/>
+              <w:left w:val="single" w:sz="4" w:space="0" w:color="CBCBCB"/>
+              <w:bottom w:val="single" w:sz="4" w:space="0" w:color="CBCBCB"/>
+              <w:right w:val="single" w:sz="4" w:space="0" w:color="CBCBCB"/>
+            </w:tcBorders>
+          </w:tcPr>
+          <w:p>
+            <w:r>
+              <w:rPr>
+                <w:sz w:val="20"/>
+              </w:rPr>
+              <w:t>SC-08</w:t>
+            </w:r>
+          </w:p>
+        </w:tc>
+        <w:tc>
+          <w:tcPr>
+            <w:tcW w:type="dxa" w:w="1938"/>
+            <w:tcBorders>
+              <w:top w:val="single" w:sz="4" w:space="0" w:color="CBCBCB"/>
+              <w:left w:val="single" w:sz="4" w:space="0" w:color="CBCBCB"/>
+              <w:bottom w:val="single" w:sz="4" w:space="0" w:color="CBCBCB"/>
+              <w:right w:val="single" w:sz="4" w:space="0" w:color="CBCBCB"/>
+            </w:tcBorders>
+          </w:tcPr>
+          <w:p>
+            <w:r>
+              <w:rPr>
+                <w:sz w:val="20"/>
+              </w:rPr>
+              <w:t>API key override bằng env var</w:t>
+            </w:r>
+          </w:p>
+        </w:tc>
+        <w:tc>
+          <w:tcPr>
+            <w:tcW w:type="dxa" w:w="1938"/>
+            <w:tcBorders>
+              <w:top w:val="single" w:sz="4" w:space="0" w:color="CBCBCB"/>
+              <w:left w:val="single" w:sz="4" w:space="0" w:color="CBCBCB"/>
+              <w:bottom w:val="single" w:sz="4" w:space="0" w:color="CBCBCB"/>
+              <w:right w:val="single" w:sz="4" w:space="0" w:color="CBCBCB"/>
+            </w:tcBorders>
+          </w:tcPr>
+          <w:p>
+            <w:r>
+              <w:rPr>
+                <w:sz w:val="20"/>
+              </w:rPr>
+              <w:t>Partial</w:t>
+            </w:r>
+          </w:p>
+        </w:tc>
+        <w:tc>
+          <w:tcPr>
+            <w:tcW w:type="dxa" w:w="1938"/>
+            <w:tcBorders>
+              <w:top w:val="single" w:sz="4" w:space="0" w:color="CBCBCB"/>
+              <w:left w:val="single" w:sz="4" w:space="0" w:color="CBCBCB"/>
+              <w:bottom w:val="single" w:sz="4" w:space="0" w:color="CBCBCB"/>
+              <w:right w:val="single" w:sz="4" w:space="0" w:color="CBCBCB"/>
+            </w:tcBorders>
+          </w:tcPr>
+          <w:p>
+            <w:r>
+              <w:rPr>
+                <w:sz w:val="20"/>
+              </w:rPr>
+              <w:t xml:space="preserve">Không test đầy đủ qua HTTP — rủi ro ghi nhận, verify khi DevOps deploy docker với env </w:t>
+            </w:r>
+            <w:r>
+              <w:rPr>
+                <w:rFonts w:ascii="Courier New" w:hAnsi="Courier New"/>
+                <w:color w:val="F05922"/>
+                <w:sz w:val="20"/>
+              </w:rPr>
+              <w:t>LaunchApp__ApiKey</w:t>
+            </w:r>
+          </w:p>
+        </w:tc>
+        <w:tc>
+          <w:tcPr>
+            <w:tcW w:type="dxa" w:w="1938"/>
+            <w:tcBorders>
+              <w:top w:val="single" w:sz="4" w:space="0" w:color="CBCBCB"/>
+              <w:left w:val="single" w:sz="4" w:space="0" w:color="CBCBCB"/>
+              <w:bottom w:val="single" w:sz="4" w:space="0" w:color="CBCBCB"/>
+              <w:right w:val="single" w:sz="4" w:space="0" w:color="CBCBCB"/>
+            </w:tcBorders>
+          </w:tcPr>
+          <w:p>
+            <w:r>
+              <w:rPr>
+                <w:sz w:val="20"/>
+              </w:rPr>
+              <w:t>Conditional</w:t>
+            </w:r>
+          </w:p>
+        </w:tc>
+      </w:tr>
+    </w:tbl>
+    <w:p/>
+    <w:p>
+      <w:pPr>
+        <w:spacing w:after="80"/>
+      </w:pPr>
+      <w:r>
+        <w:rPr>
+          <w:b/>
+          <w:sz w:val="21"/>
+        </w:rPr>
+        <w:t>Coverage: 8/8 SC đã được cover</w:t>
+      </w:r>
+      <w:r>
+        <w:rPr>
+          <w:sz w:val="21"/>
+        </w:rPr>
+        <w:t xml:space="preserve"> (SC-08 partial — điều kiện verify rõ ràng tại STEP-4.3/4.4).</w:t>
+      </w:r>
+    </w:p>
+    <w:p>
+      <w:pPr>
+        <w:pStyle w:val="Heading3"/>
+        <w:spacing w:before="160" w:after="60"/>
+      </w:pPr>
+      <w:r>
+        <w:rPr>
+          <w:color w:val="4A3F8C"/>
+          <w:sz w:val="24"/>
+        </w:rPr>
+        <w:t>Trạng thái bug</w:t>
+      </w:r>
+    </w:p>
+    <w:p>
+      <w:pPr>
+        <w:pStyle w:val="ListBullet"/>
+        <w:spacing w:after="20"/>
+        <w:ind w:left="283"/>
+      </w:pPr>
+      <w:r>
+        <w:rPr>
+          <w:sz w:val="21"/>
+        </w:rPr>
+        <w:t xml:space="preserve">P0 bug open: </w:t>
+      </w:r>
+      <w:r>
+        <w:rPr>
+          <w:b/>
+          <w:sz w:val="21"/>
+        </w:rPr>
+        <w:t>0</w:t>
+      </w:r>
+    </w:p>
+    <w:p>
+      <w:pPr>
+        <w:pStyle w:val="ListBullet"/>
+        <w:spacing w:after="20"/>
+        <w:ind w:left="283"/>
+      </w:pPr>
+      <w:r>
+        <w:rPr>
+          <w:sz w:val="21"/>
+        </w:rPr>
+        <w:t xml:space="preserve">P1 bug open: </w:t>
+      </w:r>
+      <w:r>
+        <w:rPr>
+          <w:b/>
+          <w:sz w:val="21"/>
+        </w:rPr>
+        <w:t>0</w:t>
+      </w:r>
+    </w:p>
+    <w:p>
+      <w:pPr>
+        <w:pStyle w:val="ListBullet"/>
+        <w:spacing w:after="20"/>
+        <w:ind w:left="283"/>
+      </w:pPr>
+      <w:r>
+        <w:rPr>
+          <w:sz w:val="21"/>
+        </w:rPr>
+        <w:t xml:space="preserve">Tổng bug phát hiện: </w:t>
+      </w:r>
+      <w:r>
+        <w:rPr>
+          <w:b/>
+          <w:sz w:val="21"/>
+        </w:rPr>
+        <w:t>0</w:t>
+      </w:r>
+    </w:p>
+    <w:p>
+      <w:pPr>
+        <w:pStyle w:val="Heading3"/>
+        <w:spacing w:before="160" w:after="60"/>
+      </w:pPr>
+      <w:r>
+        <w:rPr>
+          <w:color w:val="4A3F8C"/>
+          <w:sz w:val="24"/>
+        </w:rPr>
+        <w:t>Quyết định: SIGN-OFF CÓ ĐIỀU KIỆN</w:t>
+      </w:r>
+    </w:p>
+    <w:p>
+      <w:pPr>
+        <w:spacing w:after="80"/>
+      </w:pPr>
+      <w:r>
+        <w:rPr>
+          <w:b/>
+          <w:sz w:val="21"/>
+        </w:rPr>
+        <w:t>Cho phép tiếp tục sang STEP-4.3 (DevOps Engineer deploy staging).</w:t>
+      </w:r>
+    </w:p>
+    <w:p>
+      <w:pPr>
+        <w:spacing w:after="80"/>
+      </w:pPr>
+      <w:r>
+        <w:rPr>
+          <w:b/>
+          <w:sz w:val="21"/>
+        </w:rPr>
+        <w:t>ĐIỀU KIỆN BẮT BUỘC trước khi approve production (STEP-4.4):</w:t>
+      </w:r>
+    </w:p>
+    <w:p>
+      <w:pPr>
+        <w:spacing w:before="40" w:after="40"/>
+        <w:ind w:left="567"/>
+        <w:pBdr>
+          <w:left w:val="single" w:sz="12" w:space="10" w:color="F05922"/>
+        </w:pBdr>
+      </w:pPr>
+      <w:r>
+        <w:rPr>
+          <w:color w:val="4A3F8C"/>
+        </w:rPr>
+        <w:t>TC-001 (200 OK happy path), TC-006 (422 device offline), TC-007 (422 app not installed) chỉ được verify gián tiếp qua unit test — CHƯA verify qua HTTP thật với thiết bị Android thật/emulator, do giới hạn môi trường sandbox (không có thiết bị kết nối).</w:t>
+      </w:r>
+    </w:p>
+    <w:p>
+      <w:pPr>
+        <w:spacing w:after="80"/>
+      </w:pPr>
+      <w:r>
+        <w:rPr>
+          <w:sz w:val="21"/>
+        </w:rPr>
+        <w:t>&gt;</w:t>
+      </w:r>
+    </w:p>
+    <w:p>
+      <w:pPr>
+        <w:spacing w:before="40" w:after="40"/>
+        <w:ind w:left="567"/>
+        <w:pBdr>
+          <w:left w:val="single" w:sz="12" w:space="10" w:color="F05922"/>
+        </w:pBdr>
+      </w:pPr>
+      <w:r>
+        <w:rPr>
+          <w:color w:val="4A3F8C"/>
+        </w:rPr>
+        <w:t xml:space="preserve">DevOps Engineer (STEP-4.3) và DevOps Lead (STEP-4.4) </w:t>
+      </w:r>
+      <w:r>
+        <w:rPr>
+          <w:b/>
+          <w:color w:val="4A3F8C"/>
+        </w:rPr>
+        <w:t>PHẢI</w:t>
+      </w:r>
+      <w:r>
+        <w:rPr>
+          <w:color w:val="4A3F8C"/>
+        </w:rPr>
+        <w:t xml:space="preserve"> thực hiện smoke test thủ công với thiết bị Android thật hoặc emulator tại môi trường staging, bao gồm tối thiểu 3 case sau:</w:t>
+      </w:r>
+    </w:p>
+    <w:p>
+      <w:pPr>
+        <w:spacing w:before="40" w:after="40"/>
+        <w:ind w:left="567"/>
+        <w:pBdr>
+          <w:left w:val="single" w:sz="12" w:space="10" w:color="F05922"/>
+        </w:pBdr>
+      </w:pPr>
+      <w:r>
+        <w:rPr>
+          <w:color w:val="4A3F8C"/>
+        </w:rPr>
+        <w:t>1. TC-001: Gọi POST /api/launch-app với thiết bị Online + app đã cài → phải trả HTTP 200</w:t>
+      </w:r>
+    </w:p>
+    <w:p>
+      <w:pPr>
+        <w:spacing w:before="40" w:after="40"/>
+        <w:ind w:left="567"/>
+        <w:pBdr>
+          <w:left w:val="single" w:sz="12" w:space="10" w:color="F05922"/>
+        </w:pBdr>
+      </w:pPr>
+      <w:r>
+        <w:rPr>
+          <w:color w:val="4A3F8C"/>
+        </w:rPr>
+        <w:t>2. TC-006: Gọi với thiết bị hiện diện trong DeviceState nhưng Offline → phải trả HTTP 422</w:t>
+      </w:r>
+    </w:p>
+    <w:p>
+      <w:pPr>
+        <w:spacing w:before="40" w:after="40"/>
+        <w:ind w:left="567"/>
+        <w:pBdr>
+          <w:left w:val="single" w:sz="12" w:space="10" w:color="F05922"/>
+        </w:pBdr>
+      </w:pPr>
+      <w:r>
+        <w:rPr>
+          <w:color w:val="4A3F8C"/>
+        </w:rPr>
+        <w:t>3. TC-007: Gọi với thiết bị Online nhưng app chưa cài → phải trả HTTP 422</w:t>
+      </w:r>
+    </w:p>
+    <w:p>
+      <w:pPr>
+        <w:spacing w:after="80"/>
+      </w:pPr>
+      <w:r>
+        <w:rPr>
+          <w:sz w:val="21"/>
+        </w:rPr>
+        <w:t>&gt;</w:t>
+      </w:r>
+    </w:p>
+    <w:p>
+      <w:pPr>
+        <w:spacing w:before="40" w:after="40"/>
+        <w:ind w:left="567"/>
+        <w:pBdr>
+          <w:left w:val="single" w:sz="12" w:space="10" w:color="F05922"/>
+        </w:pBdr>
+      </w:pPr>
+      <w:r>
+        <w:rPr>
+          <w:b/>
+          <w:color w:val="4A3F8C"/>
+        </w:rPr>
+        <w:t>Nếu bất kỳ case nào trong 3 case trên fail tại staging → KHÔNG được deploy production, phải quay lại fix và thông báo QA Lead.</w:t>
+      </w:r>
+    </w:p>
+    <w:p>
+      <w:pPr>
+        <w:spacing w:after="80"/>
+      </w:pPr>
+      <w:r>
+        <w:rPr>
+          <w:sz w:val="21"/>
+        </w:rPr>
+        <w:t>&gt;</w:t>
+      </w:r>
+    </w:p>
+    <w:p>
+      <w:pPr>
+        <w:spacing w:before="40" w:after="40"/>
+        <w:ind w:left="567"/>
+        <w:pBdr>
+          <w:left w:val="single" w:sz="12" w:space="10" w:color="F05922"/>
+        </w:pBdr>
+      </w:pPr>
+      <w:r>
+        <w:rPr>
+          <w:color w:val="4A3F8C"/>
+        </w:rPr>
+        <w:t xml:space="preserve">Ngoài ra, SC-08 (env var override) cần được verify khi deploy docker bằng cách đặt </w:t>
+      </w:r>
+      <w:r>
+        <w:rPr>
+          <w:rFonts w:ascii="Courier New" w:hAnsi="Courier New"/>
+          <w:color w:val="F05922"/>
+          <w:sz w:val="18"/>
+        </w:rPr>
+        <w:t>LaunchApp__ApiKey=&lt;key&gt;</w:t>
+      </w:r>
+      <w:r>
+        <w:rPr>
+          <w:color w:val="4A3F8C"/>
+        </w:rPr>
+        <w:t xml:space="preserve"> trong docker-compose/env file và xác nhận endpoint hoạt động đúng với key mới.</w:t>
+      </w:r>
+    </w:p>
+    <w:p>
+      <w:pPr>
+        <w:spacing w:after="80"/>
+      </w:pPr>
+      <w:r>
+        <w:rPr>
+          <w:b/>
+          <w:sz w:val="21"/>
+        </w:rPr>
+        <w:t>Sign-off:</w:t>
+      </w:r>
+      <w:r>
+        <w:rPr>
+          <w:sz w:val="21"/>
+        </w:rPr>
+        <w:t xml:space="preserve"> [ ✅ P0=0 ] [ ✅ P1=0 ] [ ✅ Coverage 8/8 SC ] [ ⚠️ Smoke test thiết bị thật bắt buộc trước production ]</w:t>
+      </w:r>
+    </w:p>
+    <w:p>
+      <w:pPr>
+        <w:spacing w:after="80"/>
+      </w:pPr>
+      <w:r>
+        <w:rPr>
+          <w:b/>
+          <w:sz w:val="21"/>
+        </w:rPr>
+        <w:t>QA Lead ký:</w:t>
+      </w:r>
+      <w:r>
+        <w:rPr>
+          <w:sz w:val="21"/>
+        </w:rPr>
+        <w:t xml:space="preserve"> trongtv@kztek.vn — 2026-08-18 17:07</w:t>
+      </w:r>
+    </w:p>
     <w:sectPr>
       <w:headerReference w:type="default" r:id="rId9"/>
       <w:footerReference w:type="default" r:id="rId10"/>

</xml_diff>